<commit_message>
Add real terminal screenshots to Lab 29
Seven captures from a live two-cluster run on 2026-09-27 (two kind clusters,
Kubernetes 1.37.0, Flux 2.9.5, Gitea 1.22 served to both over a NodePort on
the shared kind network).

Every documented behaviour reproduced: both clusters applied the same revision
while rendering 3/canary and 2/production; a commit to main moved only the
canary; the merge promoted production to 1.29 while it kept its own 2 replicas;
and hand-scaling production to 7 was corrected back to 2 without touching
fleet-01's 3.

Revisions quoted in the text are updated to the ones visible in the images.
The 2026-09-25 transcript keeps its own and the Evidence section says so.
artifacts/lab-29/fleetview.sh is the helper used for the side-by-side view.

Co-Authored-By: Claude Opus 5 <noreply@anthropic.com>
</commit_message>
<xml_diff>
--- a/day-3-gitops-fleet-and-governance/lab-29-flux-fleet-two-clusters.docx
+++ b/day-3-gitops-fleet-and-governance/lab-29-flux-fleet-two-clusters.docx
@@ -2,14 +2,6 @@
 <file path=word/document.xml><?xml version="1.0" encoding="utf-8"?>
 <w:document xmlns:w="http://schemas.openxmlformats.org/wordprocessingml/2006/main" xmlns:m="http://schemas.openxmlformats.org/officeDocument/2006/math" xmlns:r="http://schemas.openxmlformats.org/officeDocument/2006/relationships" xmlns:o="urn:schemas-microsoft-com:office:office" xmlns:v="urn:schemas-microsoft-com:vml" xmlns:w10="urn:schemas-microsoft-com:office:word" xmlns:a="http://schemas.openxmlformats.org/drawingml/2006/main" xmlns:pic="http://schemas.openxmlformats.org/drawingml/2006/picture" xmlns:wp="http://schemas.openxmlformats.org/drawingml/2006/wordprocessingDrawing">
   <w:body>
-    <w:p>
-      <w:pPr>
-        <w:pStyle w:val="Title"/>
-      </w:pPr>
-      <w:r>
-        <w:t xml:space="preserve">Lab 29 — Run Two Clusters as One Fleet (Flux)</w:t>
-      </w:r>
-    </w:p>
     <w:p>
       <w:pPr>
         <w:pStyle w:val="Author"/>
@@ -843,7 +835,7 @@
       </w:r>
     </w:p>
     <w:bookmarkEnd w:id="16"/>
-    <w:bookmarkStart w:id="17" w:name="X7707a52376ca57089b6f058fc385f75cbfb77f9"/>
+    <w:bookmarkStart w:id="20" w:name="X7707a52376ca57089b6f058fc385f75cbfb77f9"/>
     <w:p>
       <w:pPr>
         <w:pStyle w:val="Heading2"/>
@@ -1514,14 +1506,61 @@
       </w:r>
     </w:p>
     <w:p>
+      <w:pPr>
+        <w:pStyle w:val="FirstParagraph"/>
+      </w:pPr>
+      <w:r>
+        <w:drawing>
+          <wp:inline>
+            <wp:extent cx="5943600" cy="1099566"/>
+            <wp:effectExtent b="0" l="0" r="0" t="0"/>
+            <wp:docPr descr="Two kind clusters, with Gitea exposed on fleet-01 as a NodePort and the node's address on the shared kind network" title="" id="18" name="Picture"/>
+            <a:graphic>
+              <a:graphicData uri="http://schemas.openxmlformats.org/drawingml/2006/picture">
+                <pic:pic>
+                  <pic:nvPicPr>
+                    <pic:cNvPr descr="../artifacts/lab-29/screenshots/00-two-clusters-one-git-server.png" id="19" name="Picture"/>
+                    <pic:cNvPicPr>
+                      <a:picLocks noChangeArrowheads="1" noChangeAspect="1"/>
+                    </pic:cNvPicPr>
+                  </pic:nvPicPr>
+                  <pic:blipFill>
+                    <a:blip r:embed="rId17"/>
+                    <a:stretch>
+                      <a:fillRect/>
+                    </a:stretch>
+                  </pic:blipFill>
+                  <pic:spPr bwMode="auto">
+                    <a:xfrm>
+                      <a:off x="0" y="0"/>
+                      <a:ext cx="5943600" cy="1099566"/>
+                    </a:xfrm>
+                    <a:prstGeom prst="rect">
+                      <a:avLst/>
+                    </a:prstGeom>
+                    <a:noFill/>
+                    <a:ln w="9525">
+                      <a:noFill/>
+                      <a:headEnd/>
+                      <a:tailEnd/>
+                    </a:ln>
+                  </pic:spPr>
+                </pic:pic>
+              </a:graphicData>
+            </a:graphic>
+          </wp:inline>
+        </w:drawing>
+      </w:r>
+    </w:p>
+    <w:p>
       <w:r>
         <w:pict>
           <v:rect style="width:0;height:1.5pt" o:hralign="center" o:hrstd="t" o:hr="t"/>
         </w:pict>
       </w:r>
     </w:p>
-    <w:bookmarkEnd w:id="17"/>
-    <w:bookmarkStart w:id="18" w:name="X059399f43428ffdbc059174d85075315d456b34"/>
+    <w:bookmarkEnd w:id="20"/>
+    <w:bookmarkStart w:id="21" w:name="X059399f43428ffdbc059174d85075315d456b34"/>
     <w:p>
       <w:pPr>
         <w:pStyle w:val="Heading2"/>
@@ -1964,8 +2003,8 @@
         </w:pict>
       </w:r>
     </w:p>
-    <w:bookmarkEnd w:id="18"/>
-    <w:bookmarkStart w:id="19" w:name="X1540adb96e97f1ebf0bfe6331ab05354aa58dca"/>
+    <w:bookmarkEnd w:id="21"/>
+    <w:bookmarkStart w:id="25" w:name="X1540adb96e97f1ebf0bfe6331ab05354aa58dca"/>
     <w:p>
       <w:pPr>
         <w:pStyle w:val="Heading2"/>
@@ -2645,7 +2684,7 @@
         <w:rPr>
           <w:rStyle w:val="VerbatimChar"/>
         </w:rPr>
-        <w:t xml:space="preserve">kind-fleet-01    revision=main@sha1:f56fb79e...</w:t>
+        <w:t xml:space="preserve">kind-fleet-01    revision=main@sha1:3a929cfa...</w:t>
       </w:r>
       <w:r>
         <w:br/>
@@ -2654,7 +2693,7 @@
         <w:rPr>
           <w:rStyle w:val="VerbatimChar"/>
         </w:rPr>
-        <w:t xml:space="preserve">kind-fleet-02    revision=main@sha1:f56fb79e...</w:t>
+        <w:t xml:space="preserve">kind-fleet-02    revision=main@sha1:3a929cfa...</w:t>
       </w:r>
       <w:r>
         <w:br/>
@@ -2702,13 +2741,60 @@
         <w:rPr>
           <w:rStyle w:val="VerbatimChar"/>
         </w:rPr>
-        <w:t xml:space="preserve">f56fb79e</w:t>
+        <w:t xml:space="preserve">3a929cfa</w:t>
       </w:r>
       <w:r>
         <w:t xml:space="preserve"> </w:t>
       </w:r>
       <w:r>
         <w:t xml:space="preserve">on both. Different replica counts, different labels. Adding a tenth cluster is one ConfigMap — not a tenth copy of the manifests.</w:t>
+      </w:r>
+    </w:p>
+    <w:p>
+      <w:pPr>
+        <w:pStyle w:val="BodyText"/>
+      </w:pPr>
+      <w:r>
+        <w:drawing>
+          <wp:inline>
+            <wp:extent cx="5943600" cy="613271"/>
+            <wp:effectExtent b="0" l="0" r="0" t="0"/>
+            <wp:docPr descr="Both clusters applied main@sha1:3a929cfa — fleet-01 renders 3 replicas tagged canary, fleet-02 renders 2 tagged production" title="" id="23" name="Picture"/>
+            <a:graphic>
+              <a:graphicData uri="http://schemas.openxmlformats.org/drawingml/2006/picture">
+                <pic:pic>
+                  <pic:nvPicPr>
+                    <pic:cNvPr descr="../artifacts/lab-29/screenshots/01-same-commit-two-renders.png" id="24" name="Picture"/>
+                    <pic:cNvPicPr>
+                      <a:picLocks noChangeArrowheads="1" noChangeAspect="1"/>
+                    </pic:cNvPicPr>
+                  </pic:nvPicPr>
+                  <pic:blipFill>
+                    <a:blip r:embed="rId22"/>
+                    <a:stretch>
+                      <a:fillRect/>
+                    </a:stretch>
+                  </pic:blipFill>
+                  <pic:spPr bwMode="auto">
+                    <a:xfrm>
+                      <a:off x="0" y="0"/>
+                      <a:ext cx="5943600" cy="613271"/>
+                    </a:xfrm>
+                    <a:prstGeom prst="rect">
+                      <a:avLst/>
+                    </a:prstGeom>
+                    <a:noFill/>
+                    <a:ln w="9525">
+                      <a:noFill/>
+                      <a:headEnd/>
+                      <a:tailEnd/>
+                    </a:ln>
+                  </pic:spPr>
+                </pic:pic>
+              </a:graphicData>
+            </a:graphic>
+          </wp:inline>
+        </w:drawing>
       </w:r>
     </w:p>
     <w:p>
@@ -2784,8 +2870,8 @@
         </w:pict>
       </w:r>
     </w:p>
-    <w:bookmarkEnd w:id="19"/>
-    <w:bookmarkStart w:id="20" w:name="step-4--build-the-rollout-rings-10-min"/>
+    <w:bookmarkEnd w:id="25"/>
+    <w:bookmarkStart w:id="29" w:name="step-4--build-the-rollout-rings-10-min"/>
     <w:p>
       <w:pPr>
         <w:pStyle w:val="Heading2"/>
@@ -2998,6 +3084,53 @@
       </w:r>
       <w:r>
         <w:t xml:space="preserve">path.</w:t>
+      </w:r>
+    </w:p>
+    <w:p>
+      <w:pPr>
+        <w:pStyle w:val="BodyText"/>
+      </w:pPr>
+      <w:r>
+        <w:drawing>
+          <wp:inline>
+            <wp:extent cx="5943600" cy="613271"/>
+            <wp:effectExtent b="0" l="0" r="0" t="0"/>
+            <wp:docPr descr="After the ring split: fleet-01 tracks branch main, fleet-02 tracks branch release, both still on the same content" title="" id="27" name="Picture"/>
+            <a:graphic>
+              <a:graphicData uri="http://schemas.openxmlformats.org/drawingml/2006/picture">
+                <pic:pic>
+                  <pic:nvPicPr>
+                    <pic:cNvPr descr="../artifacts/lab-29/screenshots/02-rollout-rings.png" id="28" name="Picture"/>
+                    <pic:cNvPicPr>
+                      <a:picLocks noChangeArrowheads="1" noChangeAspect="1"/>
+                    </pic:cNvPicPr>
+                  </pic:nvPicPr>
+                  <pic:blipFill>
+                    <a:blip r:embed="rId26"/>
+                    <a:stretch>
+                      <a:fillRect/>
+                    </a:stretch>
+                  </pic:blipFill>
+                  <pic:spPr bwMode="auto">
+                    <a:xfrm>
+                      <a:off x="0" y="0"/>
+                      <a:ext cx="5943600" cy="613271"/>
+                    </a:xfrm>
+                    <a:prstGeom prst="rect">
+                      <a:avLst/>
+                    </a:prstGeom>
+                    <a:noFill/>
+                    <a:ln w="9525">
+                      <a:noFill/>
+                      <a:headEnd/>
+                      <a:tailEnd/>
+                    </a:ln>
+                  </pic:spPr>
+                </pic:pic>
+              </a:graphicData>
+            </a:graphic>
+          </wp:inline>
+        </w:drawing>
       </w:r>
     </w:p>
     <w:p>
@@ -3007,8 +3140,8 @@
         </w:pict>
       </w:r>
     </w:p>
-    <w:bookmarkEnd w:id="20"/>
-    <w:bookmarkStart w:id="21" w:name="Xc720b0b43455f0693ac4bdbe083769b8daa7507"/>
+    <w:bookmarkEnd w:id="29"/>
+    <w:bookmarkStart w:id="33" w:name="Xc720b0b43455f0693ac4bdbe083769b8daa7507"/>
     <w:p>
       <w:pPr>
         <w:pStyle w:val="Heading2"/>
@@ -3137,6 +3270,53 @@
       </w:r>
       <w:r>
         <w:t xml:space="preserve">One commit, one repository, and the blast radius was exactly one ring — enforced by the branch each cluster tracks rather than by anyone remembering to be careful.</w:t>
+      </w:r>
+    </w:p>
+    <w:p>
+      <w:pPr>
+        <w:pStyle w:val="BodyText"/>
+      </w:pPr>
+      <w:r>
+        <w:drawing>
+          <wp:inline>
+            <wp:extent cx="5943600" cy="613271"/>
+            <wp:effectExtent b="0" l="0" r="0" t="0"/>
+            <wp:docPr descr="One commit to main: the canary moves to nginx:1.29-alpine at revision b6cd2dff while production stays on 1.27-alpine at the older revision" title="" id="31" name="Picture"/>
+            <a:graphic>
+              <a:graphicData uri="http://schemas.openxmlformats.org/drawingml/2006/picture">
+                <pic:pic>
+                  <pic:nvPicPr>
+                    <pic:cNvPr descr="../artifacts/lab-29/screenshots/03-canary-only.png" id="32" name="Picture"/>
+                    <pic:cNvPicPr>
+                      <a:picLocks noChangeArrowheads="1" noChangeAspect="1"/>
+                    </pic:cNvPicPr>
+                  </pic:nvPicPr>
+                  <pic:blipFill>
+                    <a:blip r:embed="rId30"/>
+                    <a:stretch>
+                      <a:fillRect/>
+                    </a:stretch>
+                  </pic:blipFill>
+                  <pic:spPr bwMode="auto">
+                    <a:xfrm>
+                      <a:off x="0" y="0"/>
+                      <a:ext cx="5943600" cy="613271"/>
+                    </a:xfrm>
+                    <a:prstGeom prst="rect">
+                      <a:avLst/>
+                    </a:prstGeom>
+                    <a:noFill/>
+                    <a:ln w="9525">
+                      <a:noFill/>
+                      <a:headEnd/>
+                      <a:tailEnd/>
+                    </a:ln>
+                  </pic:spPr>
+                </pic:pic>
+              </a:graphicData>
+            </a:graphic>
+          </wp:inline>
+        </w:drawing>
       </w:r>
     </w:p>
     <w:p>
@@ -3174,8 +3354,8 @@
         </w:pict>
       </w:r>
     </w:p>
-    <w:bookmarkEnd w:id="21"/>
-    <w:bookmarkStart w:id="22" w:name="step-6--promote-5-min"/>
+    <w:bookmarkEnd w:id="33"/>
+    <w:bookmarkStart w:id="37" w:name="step-6--promote-5-min"/>
     <w:p>
       <w:pPr>
         <w:pStyle w:val="Heading2"/>
@@ -3384,6 +3564,53 @@
       </w:r>
       <w:r>
         <w:t xml:space="preserve">throughout: promoting a version did not overwrite the cluster's identity, because version and identity come from different places.</w:t>
+      </w:r>
+    </w:p>
+    <w:p>
+      <w:pPr>
+        <w:pStyle w:val="BodyText"/>
+      </w:pPr>
+      <w:r>
+        <w:drawing>
+          <wp:inline>
+            <wp:extent cx="5943600" cy="613271"/>
+            <wp:effectExtent b="0" l="0" r="0" t="0"/>
+            <wp:docPr descr="After merging main into release, production runs nginx:1.29-alpine at release@sha1:ab3b0282 — and is still at 2 replicas, not the canary's 3" title="" id="35" name="Picture"/>
+            <a:graphic>
+              <a:graphicData uri="http://schemas.openxmlformats.org/drawingml/2006/picture">
+                <pic:pic>
+                  <pic:nvPicPr>
+                    <pic:cNvPr descr="../artifacts/lab-29/screenshots/04-promoted.png" id="36" name="Picture"/>
+                    <pic:cNvPicPr>
+                      <a:picLocks noChangeArrowheads="1" noChangeAspect="1"/>
+                    </pic:cNvPicPr>
+                  </pic:nvPicPr>
+                  <pic:blipFill>
+                    <a:blip r:embed="rId34"/>
+                    <a:stretch>
+                      <a:fillRect/>
+                    </a:stretch>
+                  </pic:blipFill>
+                  <pic:spPr bwMode="auto">
+                    <a:xfrm>
+                      <a:off x="0" y="0"/>
+                      <a:ext cx="5943600" cy="613271"/>
+                    </a:xfrm>
+                    <a:prstGeom prst="rect">
+                      <a:avLst/>
+                    </a:prstGeom>
+                    <a:noFill/>
+                    <a:ln w="9525">
+                      <a:noFill/>
+                      <a:headEnd/>
+                      <a:tailEnd/>
+                    </a:ln>
+                  </pic:spPr>
+                </pic:pic>
+              </a:graphicData>
+            </a:graphic>
+          </wp:inline>
+        </w:drawing>
       </w:r>
     </w:p>
     <w:p>
@@ -3393,8 +3620,8 @@
         </w:pict>
       </w:r>
     </w:p>
-    <w:bookmarkEnd w:id="22"/>
-    <w:bookmarkStart w:id="23" w:name="step-7--drift-on-one-cluster-only-10-min"/>
+    <w:bookmarkEnd w:id="37"/>
+    <w:bookmarkStart w:id="44" w:name="step-7--drift-on-one-cluster-only-10-min"/>
     <w:p>
       <w:pPr>
         <w:pStyle w:val="Heading2"/>
@@ -3523,6 +3750,100 @@
       </w:r>
       <w:r>
         <w:t xml:space="preserve">— not to a fleet-wide constant. fleet-02 returns to 2 while fleet-01 stays on 3, because each is being reconciled against its own render of the same commit.</w:t>
+      </w:r>
+    </w:p>
+    <w:p>
+      <w:pPr>
+        <w:pStyle w:val="BodyText"/>
+      </w:pPr>
+      <w:r>
+        <w:drawing>
+          <wp:inline>
+            <wp:extent cx="5943600" cy="694320"/>
+            <wp:effectExtent b="0" l="0" r="0" t="0"/>
+            <wp:docPr descr="Immediately after scaling production by hand: fleet-02 shows replicas=7 ready=2/7 while fleet-01 is untouched at 3" title="" id="39" name="Picture"/>
+            <a:graphic>
+              <a:graphicData uri="http://schemas.openxmlformats.org/drawingml/2006/picture">
+                <pic:pic>
+                  <pic:nvPicPr>
+                    <pic:cNvPr descr="../artifacts/lab-29/screenshots/05-drift-introduced.png" id="40" name="Picture"/>
+                    <pic:cNvPicPr>
+                      <a:picLocks noChangeArrowheads="1" noChangeAspect="1"/>
+                    </pic:cNvPicPr>
+                  </pic:nvPicPr>
+                  <pic:blipFill>
+                    <a:blip r:embed="rId38"/>
+                    <a:stretch>
+                      <a:fillRect/>
+                    </a:stretch>
+                  </pic:blipFill>
+                  <pic:spPr bwMode="auto">
+                    <a:xfrm>
+                      <a:off x="0" y="0"/>
+                      <a:ext cx="5943600" cy="694320"/>
+                    </a:xfrm>
+                    <a:prstGeom prst="rect">
+                      <a:avLst/>
+                    </a:prstGeom>
+                    <a:noFill/>
+                    <a:ln w="9525">
+                      <a:noFill/>
+                      <a:headEnd/>
+                      <a:tailEnd/>
+                    </a:ln>
+                  </pic:spPr>
+                </pic:pic>
+              </a:graphicData>
+            </a:graphic>
+          </wp:inline>
+        </w:drawing>
+      </w:r>
+    </w:p>
+    <w:p>
+      <w:pPr>
+        <w:pStyle w:val="BodyText"/>
+      </w:pPr>
+      <w:r>
+        <w:drawing>
+          <wp:inline>
+            <wp:extent cx="5943600" cy="613271"/>
+            <wp:effectExtent b="0" l="0" r="0" t="0"/>
+            <wp:docPr descr="Roughly one reconcile interval later: fleet-02 is back to 2 — its own rendered value — and fleet-01 is still 3" title="" id="42" name="Picture"/>
+            <a:graphic>
+              <a:graphicData uri="http://schemas.openxmlformats.org/drawingml/2006/picture">
+                <pic:pic>
+                  <pic:nvPicPr>
+                    <pic:cNvPr descr="../artifacts/lab-29/screenshots/06-drift-corrected-per-cluster.png" id="43" name="Picture"/>
+                    <pic:cNvPicPr>
+                      <a:picLocks noChangeArrowheads="1" noChangeAspect="1"/>
+                    </pic:cNvPicPr>
+                  </pic:nvPicPr>
+                  <pic:blipFill>
+                    <a:blip r:embed="rId41"/>
+                    <a:stretch>
+                      <a:fillRect/>
+                    </a:stretch>
+                  </pic:blipFill>
+                  <pic:spPr bwMode="auto">
+                    <a:xfrm>
+                      <a:off x="0" y="0"/>
+                      <a:ext cx="5943600" cy="613271"/>
+                    </a:xfrm>
+                    <a:prstGeom prst="rect">
+                      <a:avLst/>
+                    </a:prstGeom>
+                    <a:noFill/>
+                    <a:ln w="9525">
+                      <a:noFill/>
+                      <a:headEnd/>
+                      <a:tailEnd/>
+                    </a:ln>
+                  </pic:spPr>
+                </pic:pic>
+              </a:graphicData>
+            </a:graphic>
+          </wp:inline>
+        </w:drawing>
       </w:r>
     </w:p>
     <w:p>
@@ -3540,8 +3861,8 @@
         </w:pict>
       </w:r>
     </w:p>
-    <w:bookmarkEnd w:id="23"/>
-    <w:bookmarkStart w:id="24" w:name="step-8--do-it-again-yourself-unassisted"/>
+    <w:bookmarkEnd w:id="44"/>
+    <w:bookmarkStart w:id="45" w:name="step-8--do-it-again-yourself-unassisted"/>
     <w:p>
       <w:pPr>
         <w:pStyle w:val="Heading2"/>
@@ -3845,8 +4166,8 @@
         </w:pict>
       </w:r>
     </w:p>
-    <w:bookmarkEnd w:id="24"/>
-    <w:bookmarkStart w:id="25" w:name="step-9--clean-up"/>
+    <w:bookmarkEnd w:id="45"/>
+    <w:bookmarkStart w:id="46" w:name="step-9--clean-up"/>
     <w:p>
       <w:pPr>
         <w:pStyle w:val="Heading2"/>
@@ -3918,8 +4239,8 @@
         </w:pict>
       </w:r>
     </w:p>
-    <w:bookmarkEnd w:id="25"/>
-    <w:bookmarkStart w:id="26" w:name="what-you-learned"/>
+    <w:bookmarkEnd w:id="46"/>
+    <w:bookmarkStart w:id="47" w:name="what-you-learned"/>
     <w:p>
       <w:pPr>
         <w:pStyle w:val="Heading2"/>
@@ -4016,7 +4337,7 @@
               <w:rPr>
                 <w:rStyle w:val="VerbatimChar"/>
               </w:rPr>
-              <w:t xml:space="preserve">main@sha1:f56fb79e</w:t>
+              <w:t xml:space="preserve">main@sha1:3a929cfa</w:t>
             </w:r>
           </w:p>
         </w:tc>
@@ -4353,8 +4674,8 @@
         </w:tc>
       </w:tr>
     </w:tbl>
-    <w:bookmarkEnd w:id="26"/>
-    <w:bookmarkStart w:id="29" w:name="evidence"/>
+    <w:bookmarkEnd w:id="47"/>
+    <w:bookmarkStart w:id="52" w:name="evidence"/>
     <w:p>
       <w:pPr>
         <w:pStyle w:val="Heading2"/>
@@ -4373,7 +4694,7 @@
       <w:r>
         <w:t xml:space="preserve"> </w:t>
       </w:r>
-      <w:hyperlink r:id="rId27">
+      <w:hyperlink r:id="rId48">
         <w:r>
           <w:rPr>
             <w:rStyle w:val="VerbatimChar"/>
@@ -4390,32 +4711,131 @@
     </w:p>
     <w:p>
       <w:pPr>
+        <w:pStyle w:val="BodyText"/>
+      </w:pPr>
+      <w:r>
+        <w:t xml:space="preserve">Real terminal captures are in</w:t>
+      </w:r>
+      <w:r>
+        <w:t xml:space="preserve"> </w:t>
+      </w:r>
+      <w:hyperlink r:id="rId49">
+        <w:r>
+          <w:rPr>
+            <w:rStyle w:val="VerbatimChar"/>
+          </w:rPr>
+          <w:t xml:space="preserve">artifacts/lab-29/screenshots/</w:t>
+        </w:r>
+      </w:hyperlink>
+      <w:r>
+        <w:t xml:space="preserve"> </w:t>
+      </w:r>
+      <w:r>
+        <w:t xml:space="preserve">(7 images) from a live two-cluster run on 2026-09-27 — Kubernetes 1.37.0, Flux 2.9.5, Gitea 1.22.</w:t>
+      </w:r>
+      <w:r>
+        <w:t xml:space="preserve"> </w:t>
+      </w:r>
+      <w:r>
+        <w:t xml:space="preserve">The helper used for the side-by-side view is</w:t>
+      </w:r>
+      <w:r>
+        <w:t xml:space="preserve"> </w:t>
+      </w:r>
+      <w:hyperlink r:id="rId50">
+        <w:r>
+          <w:rPr>
+            <w:rStyle w:val="VerbatimChar"/>
+          </w:rPr>
+          <w:t xml:space="preserve">artifacts/lab-29/fleetview.sh</w:t>
+        </w:r>
+      </w:hyperlink>
+      <w:r>
+        <w:t xml:space="preserve">.</w:t>
+      </w:r>
+    </w:p>
+    <w:p>
+      <w:pPr>
         <w:pStyle w:val="BlockText"/>
       </w:pPr>
-      <w:r>
-        <w:t xml:space="preserve">📷</w:t>
-      </w:r>
-      <w:r>
-        <w:t xml:space="preserve"> </w:t>
-      </w:r>
       <w:r>
         <w:rPr>
           <w:b/>
           <w:bCs/>
         </w:rPr>
-        <w:t xml:space="preserve">Screenshots outstanding.</w:t>
-      </w:r>
-      <w:r>
-        <w:t xml:space="preserve"> </w:t>
-      </w:r>
-      <w:r>
-        <w:t xml:space="preserve">Terminal captures have not been taken. The transcript is the</w:t>
-      </w:r>
-      <w:r>
-        <w:t xml:space="preserve"> </w:t>
-      </w:r>
-      <w:r>
-        <w:t xml:space="preserve">authoritative record until they are.</w:t>
+        <w:t xml:space="preserve">Note.</w:t>
+      </w:r>
+      <w:r>
+        <w:t xml:space="preserve"> </w:t>
+      </w:r>
+      <w:r>
+        <w:t xml:space="preserve">The screenshots come from a later run than the transcript, so the revisions differ —</w:t>
+      </w:r>
+      <w:r>
+        <w:t xml:space="preserve"> </w:t>
+      </w:r>
+      <w:r>
+        <w:t xml:space="preserve">the images show</w:t>
+      </w:r>
+      <w:r>
+        <w:t xml:space="preserve"> </w:t>
+      </w:r>
+      <w:r>
+        <w:rPr>
+          <w:rStyle w:val="VerbatimChar"/>
+        </w:rPr>
+        <w:t xml:space="preserve">3a929cfa</w:t>
+      </w:r>
+      <w:r>
+        <w:t xml:space="preserve"> </w:t>
+      </w:r>
+      <w:r>
+        <w:t xml:space="preserve">/</w:t>
+      </w:r>
+      <w:r>
+        <w:t xml:space="preserve"> </w:t>
+      </w:r>
+      <w:r>
+        <w:rPr>
+          <w:rStyle w:val="VerbatimChar"/>
+        </w:rPr>
+        <w:t xml:space="preserve">b6cd2dff</w:t>
+      </w:r>
+      <w:r>
+        <w:t xml:space="preserve"> </w:t>
+      </w:r>
+      <w:r>
+        <w:t xml:space="preserve">/</w:t>
+      </w:r>
+      <w:r>
+        <w:t xml:space="preserve"> </w:t>
+      </w:r>
+      <w:r>
+        <w:rPr>
+          <w:rStyle w:val="VerbatimChar"/>
+        </w:rPr>
+        <w:t xml:space="preserve">ab3b0282</w:t>
+      </w:r>
+      <w:r>
+        <w:t xml:space="preserve">, the transcript shows</w:t>
+      </w:r>
+      <w:r>
+        <w:t xml:space="preserve"> </w:t>
+      </w:r>
+      <w:r>
+        <w:rPr>
+          <w:rStyle w:val="VerbatimChar"/>
+        </w:rPr>
+        <w:t xml:space="preserve">f56fb79e</w:t>
+      </w:r>
+      <w:r>
+        <w:t xml:space="preserve">. Every</w:t>
+      </w:r>
+      <w:r>
+        <w:t xml:space="preserve"> </w:t>
+      </w:r>
+      <w:r>
+        <w:t xml:space="preserve">behaviour is identical.</w:t>
       </w:r>
     </w:p>
     <w:p>
@@ -4439,7 +4859,7 @@
       <w:r>
         <w:t xml:space="preserve"> </w:t>
       </w:r>
-      <w:hyperlink r:id="rId28">
+      <w:hyperlink r:id="rId51">
         <w:r>
           <w:rPr>
             <w:rStyle w:val="Hyperlink"/>
@@ -4470,7 +4890,7 @@
         <w:t xml:space="preserve">across three clusters. Comparing the two is the Module 10 design discussion.</w:t>
       </w:r>
     </w:p>
-    <w:bookmarkEnd w:id="29"/>
+    <w:bookmarkEnd w:id="52"/>
     <w:sectPr>
       <w:pgSz w:h="15840" w:w="12240"/>
       <w:pgMar w:bottom="1440" w:footer="720" w:gutter="0" w:header="720" w:left="1440" w:right="1440" w:top="1440"/>

</xml_diff>